<commit_message>
Mission Dash Update 2
</commit_message>
<xml_diff>
--- a/Hints.docx
+++ b/Hints.docx
@@ -6,12 +6,6 @@
       <w:tblPr>
         <w:tblStyle w:val="TableGrid"/>
         <w:tblW w:w="9360" w:type="dxa"/>
-        <w:tblBorders>
-          <w:top w:val="none" w:sz="0" w:space="0" w:color="auto"/>
-          <w:left w:val="none" w:sz="0" w:space="0" w:color="auto"/>
-          <w:bottom w:val="none" w:sz="0" w:space="0" w:color="auto"/>
-          <w:right w:val="none" w:sz="0" w:space="0" w:color="auto"/>
-        </w:tblBorders>
         <w:tblLook w:val="04A0" w:firstRow="1" w:lastRow="0" w:firstColumn="1" w:lastColumn="0" w:noHBand="0" w:noVBand="1"/>
       </w:tblPr>
       <w:tblGrid>
@@ -38,14 +32,12 @@
             <w:r>
               <w:rPr>
                 <w:noProof/>
-                <w:sz w:val="40"/>
-                <w:szCs w:val="40"/>
               </w:rPr>
               <w:drawing>
-                <wp:inline distT="0" distB="0" distL="0" distR="0" wp14:anchorId="0DF2A8CC" wp14:editId="12DF9D4B">
-                  <wp:extent cx="2743200" cy="2743200"/>
-                  <wp:effectExtent l="0" t="0" r="0" b="0"/>
-                  <wp:docPr id="1" name="Picture 1"/>
+                <wp:inline distT="0" distB="0" distL="0" distR="0" wp14:anchorId="35DD59CE" wp14:editId="55B17927">
+                  <wp:extent cx="2714625" cy="2714625"/>
+                  <wp:effectExtent l="0" t="0" r="9525" b="9525"/>
+                  <wp:docPr id="3" name="Picture 3"/>
                   <wp:cNvGraphicFramePr>
                     <a:graphicFrameLocks xmlns:a="http://schemas.openxmlformats.org/drawingml/2006/main" noChangeAspect="1"/>
                   </wp:cNvGraphicFramePr>
@@ -53,7 +45,7 @@
                     <a:graphicData uri="http://schemas.openxmlformats.org/drawingml/2006/picture">
                       <pic:pic xmlns:pic="http://schemas.openxmlformats.org/drawingml/2006/picture">
                         <pic:nvPicPr>
-                          <pic:cNvPr id="0" name="Picture 1"/>
+                          <pic:cNvPr id="0" name="Picture 2"/>
                           <pic:cNvPicPr>
                             <a:picLocks noChangeAspect="1" noChangeArrowheads="1"/>
                           </pic:cNvPicPr>
@@ -74,7 +66,7 @@
                         <pic:spPr bwMode="auto">
                           <a:xfrm>
                             <a:off x="0" y="0"/>
-                            <a:ext cx="2743200" cy="2743200"/>
+                            <a:ext cx="2714625" cy="2714625"/>
                           </a:xfrm>
                           <a:prstGeom prst="rect">
                             <a:avLst/>

</xml_diff>

<commit_message>
Adding Delta and Misc
</commit_message>
<xml_diff>
--- a/Hints.docx
+++ b/Hints.docx
@@ -25,12 +25,14 @@
             <w:pPr>
               <w:jc w:val="center"/>
               <w:rPr>
-                <w:sz w:val="40"/>
-                <w:szCs w:val="40"/>
-              </w:rPr>
-            </w:pPr>
-            <w:r>
-              <w:rPr>
+                <w:rFonts w:ascii="Courier New" w:hAnsi="Courier New" w:cs="Courier New"/>
+                <w:sz w:val="40"/>
+                <w:szCs w:val="40"/>
+              </w:rPr>
+            </w:pPr>
+            <w:r>
+              <w:rPr>
+                <w:rFonts w:ascii="Courier New" w:hAnsi="Courier New" w:cs="Courier New"/>
                 <w:noProof/>
               </w:rPr>
               <w:drawing>
@@ -93,16 +95,71 @@
             <w:pPr>
               <w:jc w:val="center"/>
               <w:rPr>
-                <w:sz w:val="40"/>
-                <w:szCs w:val="40"/>
-              </w:rPr>
-            </w:pPr>
-            <w:r>
-              <w:rPr>
-                <w:sz w:val="40"/>
-                <w:szCs w:val="40"/>
-              </w:rPr>
-              <w:t>20 8 18 5 5 5 9 7 8 20 16 15 9 14 20 15 14 5 19 5 3 15 14 4 19 14 15 18 20 8</w:t>
+                <w:rFonts w:ascii="Courier New" w:hAnsi="Courier New" w:cs="Courier New"/>
+                <w:b/>
+                <w:bCs/>
+                <w:sz w:val="40"/>
+                <w:szCs w:val="40"/>
+              </w:rPr>
+            </w:pPr>
+            <w:r>
+              <w:rPr>
+                <w:rFonts w:ascii="Courier New" w:hAnsi="Courier New" w:cs="Courier New"/>
+                <w:b/>
+                <w:bCs/>
+                <w:sz w:val="40"/>
+                <w:szCs w:val="40"/>
+              </w:rPr>
+              <w:t>DD</w:t>
+            </w:r>
+            <w:r>
+              <w:rPr>
+                <w:rFonts w:ascii="Courier New" w:hAnsi="Courier New" w:cs="Courier New"/>
+                <w:b/>
+                <w:bCs/>
+                <w:sz w:val="40"/>
+                <w:szCs w:val="40"/>
+                <w:vertAlign w:val="superscript"/>
+              </w:rPr>
+              <w:t xml:space="preserve">O </w:t>
+            </w:r>
+            <w:r>
+              <w:rPr>
+                <w:rFonts w:ascii="Courier New" w:hAnsi="Courier New" w:cs="Courier New"/>
+                <w:b/>
+                <w:bCs/>
+                <w:sz w:val="40"/>
+                <w:szCs w:val="40"/>
+              </w:rPr>
+              <w:t>C’</w:t>
+            </w:r>
+          </w:p>
+          <w:p>
+            <w:pPr>
+              <w:jc w:val="center"/>
+              <w:rPr>
+                <w:rFonts w:ascii="Courier New" w:hAnsi="Courier New" w:cs="Courier New"/>
+                <w:sz w:val="40"/>
+                <w:szCs w:val="40"/>
+              </w:rPr>
+            </w:pPr>
+          </w:p>
+          <w:p>
+            <w:pPr>
+              <w:jc w:val="center"/>
+              <w:rPr>
+                <w:rFonts w:ascii="Courier New" w:hAnsi="Courier New" w:cs="Courier New"/>
+                <w:sz w:val="40"/>
+                <w:szCs w:val="40"/>
+              </w:rPr>
+            </w:pPr>
+            <w:r>
+              <w:rPr>
+                <w:rFonts w:ascii="Courier New" w:hAnsi="Courier New" w:cs="Courier New"/>
+                <w:sz w:val="40"/>
+                <w:szCs w:val="40"/>
+              </w:rPr>
+              <w:t>MPDBUF UIF CSPOAF QSJNBSZ OBWJHBUJPOBM EJBM.</w:t>
             </w:r>
           </w:p>
         </w:tc>
@@ -120,19 +177,66 @@
             <w:pPr>
               <w:jc w:val="center"/>
               <w:rPr>
-                <w:sz w:val="40"/>
-                <w:szCs w:val="40"/>
-              </w:rPr>
-            </w:pPr>
-            <w:r>
-              <w:rPr>
-                <w:sz w:val="40"/>
-                <w:szCs w:val="40"/>
-              </w:rPr>
-              <w:t>6 15 21 18 6 15 21 18 4 5 7 18 5 5 19 26 5 18 15 20 8 18 5 5 13 9 14 21 20 5 19</w:t>
-            </w:r>
-            <w:r>
-              <w:rPr>
+                <w:rFonts w:ascii="Courier New" w:hAnsi="Courier New" w:cs="Courier New"/>
+                <w:b/>
+                <w:bCs/>
+                <w:sz w:val="40"/>
+                <w:szCs w:val="40"/>
+              </w:rPr>
+            </w:pPr>
+            <w:proofErr w:type="gramStart"/>
+            <w:r>
+              <w:rPr>
+                <w:rFonts w:ascii="Courier New" w:hAnsi="Courier New" w:cs="Courier New"/>
+                <w:b/>
+                <w:bCs/>
+                <w:sz w:val="40"/>
+                <w:szCs w:val="40"/>
+              </w:rPr>
+              <w:t>CH.A</w:t>
+            </w:r>
+            <w:proofErr w:type="gramEnd"/>
+            <w:r>
+              <w:rPr>
+                <w:rFonts w:ascii="Courier New" w:hAnsi="Courier New" w:cs="Courier New"/>
+                <w:b/>
+                <w:bCs/>
+                <w:sz w:val="40"/>
+                <w:szCs w:val="40"/>
+              </w:rPr>
+              <w:t>” 14</w:t>
+            </w:r>
+          </w:p>
+          <w:p>
+            <w:pPr>
+              <w:jc w:val="center"/>
+              <w:rPr>
+                <w:rFonts w:ascii="Courier New" w:hAnsi="Courier New" w:cs="Courier New"/>
+                <w:sz w:val="40"/>
+                <w:szCs w:val="40"/>
+              </w:rPr>
+            </w:pPr>
+          </w:p>
+          <w:p>
+            <w:pPr>
+              <w:jc w:val="center"/>
+              <w:rPr>
+                <w:rFonts w:ascii="Courier New" w:hAnsi="Courier New" w:cs="Courier New"/>
+                <w:sz w:val="40"/>
+                <w:szCs w:val="40"/>
+              </w:rPr>
+            </w:pPr>
+            <w:r>
+              <w:rPr>
+                <w:rFonts w:ascii="Courier New" w:hAnsi="Courier New" w:cs="Courier New"/>
+                <w:sz w:val="40"/>
+                <w:szCs w:val="40"/>
+              </w:rPr>
+              <w:t>CIITGICVG VJG VQVCN OKNGCIG QH VJGUG HQWT RGCMU.</w:t>
+            </w:r>
+            <w:r>
+              <w:rPr>
+                <w:rFonts w:ascii="Courier New" w:hAnsi="Courier New" w:cs="Courier New"/>
                 <w:sz w:val="40"/>
                 <w:szCs w:val="40"/>
               </w:rPr>
@@ -149,16 +253,71 @@
             <w:pPr>
               <w:jc w:val="center"/>
               <w:rPr>
-                <w:sz w:val="40"/>
-                <w:szCs w:val="40"/>
-              </w:rPr>
-            </w:pPr>
-            <w:r>
-              <w:rPr>
-                <w:sz w:val="40"/>
-                <w:szCs w:val="40"/>
-              </w:rPr>
-              <w:t>15 14 5 20 23 15 15 14 5 4 5 7 18 5 5 19 15 14 5 19 9 24 13 9 14 21 20 5 19</w:t>
+                <w:rFonts w:ascii="Courier New" w:hAnsi="Courier New" w:cs="Courier New"/>
+                <w:b/>
+                <w:bCs/>
+                <w:sz w:val="40"/>
+                <w:szCs w:val="40"/>
+              </w:rPr>
+            </w:pPr>
+            <w:r>
+              <w:rPr>
+                <w:rFonts w:ascii="Courier New" w:hAnsi="Courier New" w:cs="Courier New"/>
+                <w:b/>
+                <w:bCs/>
+                <w:sz w:val="40"/>
+                <w:szCs w:val="40"/>
+              </w:rPr>
+              <w:t>ABA</w:t>
+            </w:r>
+            <w:r>
+              <w:rPr>
+                <w:rFonts w:ascii="Courier New" w:hAnsi="Courier New" w:cs="Courier New"/>
+                <w:b/>
+                <w:bCs/>
+                <w:sz w:val="40"/>
+                <w:szCs w:val="40"/>
+                <w:vertAlign w:val="superscript"/>
+              </w:rPr>
+              <w:t>O</w:t>
+            </w:r>
+            <w:r>
+              <w:rPr>
+                <w:rFonts w:ascii="Courier New" w:hAnsi="Courier New" w:cs="Courier New"/>
+                <w:b/>
+                <w:bCs/>
+                <w:sz w:val="40"/>
+                <w:szCs w:val="40"/>
+              </w:rPr>
+              <w:t xml:space="preserve"> AF’</w:t>
+            </w:r>
+          </w:p>
+          <w:p>
+            <w:pPr>
+              <w:jc w:val="center"/>
+              <w:rPr>
+                <w:rFonts w:ascii="Courier New" w:hAnsi="Courier New" w:cs="Courier New"/>
+                <w:sz w:val="40"/>
+                <w:szCs w:val="40"/>
+              </w:rPr>
+            </w:pPr>
+          </w:p>
+          <w:p>
+            <w:pPr>
+              <w:jc w:val="center"/>
+              <w:rPr>
+                <w:rFonts w:ascii="Courier New" w:hAnsi="Courier New" w:cs="Courier New"/>
+                <w:sz w:val="40"/>
+                <w:szCs w:val="40"/>
+              </w:rPr>
+            </w:pPr>
+            <w:r>
+              <w:rPr>
+                <w:rFonts w:ascii="Courier New" w:hAnsi="Courier New" w:cs="Courier New"/>
+                <w:sz w:val="40"/>
+                <w:szCs w:val="40"/>
+              </w:rPr>
+              <w:t>AVWFLAXQ LZW XGMJ USJVAFSD HWSCK</w:t>
             </w:r>
           </w:p>
         </w:tc>
@@ -176,14 +335,16 @@
             <w:pPr>
               <w:jc w:val="center"/>
               <w:rPr>
-                <w:b/>
-                <w:bCs/>
-                <w:sz w:val="40"/>
-                <w:szCs w:val="40"/>
-              </w:rPr>
-            </w:pPr>
-            <w:r>
-              <w:rPr>
+                <w:rFonts w:ascii="Courier New" w:hAnsi="Courier New" w:cs="Courier New"/>
+                <w:b/>
+                <w:bCs/>
+                <w:sz w:val="40"/>
+                <w:szCs w:val="40"/>
+              </w:rPr>
+            </w:pPr>
+            <w:r>
+              <w:rPr>
+                <w:rFonts w:ascii="Courier New" w:hAnsi="Courier New" w:cs="Courier New"/>
                 <w:b/>
                 <w:bCs/>
                 <w:sz w:val="40"/>
@@ -197,12 +358,14 @@
             <w:pPr>
               <w:jc w:val="center"/>
               <w:rPr>
-                <w:sz w:val="40"/>
-                <w:szCs w:val="40"/>
-              </w:rPr>
-            </w:pPr>
-            <w:r>
-              <w:rPr>
+                <w:rFonts w:ascii="Courier New" w:hAnsi="Courier New" w:cs="Courier New"/>
+                <w:sz w:val="40"/>
+                <w:szCs w:val="40"/>
+              </w:rPr>
+            </w:pPr>
+            <w:r>
+              <w:rPr>
+                <w:rFonts w:ascii="Courier New" w:hAnsi="Courier New" w:cs="Courier New"/>
                 <w:sz w:val="40"/>
                 <w:szCs w:val="40"/>
               </w:rPr>
@@ -219,12 +382,14 @@
             <w:pPr>
               <w:jc w:val="center"/>
               <w:rPr>
+                <w:rFonts w:ascii="Arial Black" w:hAnsi="Arial Black" w:cs="Courier New"/>
                 <w:sz w:val="380"/>
                 <w:szCs w:val="380"/>
               </w:rPr>
             </w:pPr>
             <w:r>
               <w:rPr>
+                <w:rFonts w:ascii="Arial Black" w:hAnsi="Arial Black" w:cs="Courier New"/>
                 <w:sz w:val="380"/>
                 <w:szCs w:val="380"/>
               </w:rPr>
@@ -246,14 +411,16 @@
             <w:pPr>
               <w:jc w:val="center"/>
               <w:rPr>
-                <w:b/>
-                <w:bCs/>
-                <w:sz w:val="40"/>
-                <w:szCs w:val="40"/>
-              </w:rPr>
-            </w:pPr>
-            <w:r>
-              <w:rPr>
+                <w:rFonts w:ascii="Courier New" w:hAnsi="Courier New" w:cs="Courier New"/>
+                <w:b/>
+                <w:bCs/>
+                <w:sz w:val="40"/>
+                <w:szCs w:val="40"/>
+              </w:rPr>
+            </w:pPr>
+            <w:r>
+              <w:rPr>
+                <w:rFonts w:ascii="Courier New" w:hAnsi="Courier New" w:cs="Courier New"/>
                 <w:b/>
                 <w:bCs/>
                 <w:sz w:val="40"/>
@@ -266,12 +433,14 @@
             <w:pPr>
               <w:jc w:val="center"/>
               <w:rPr>
-                <w:sz w:val="40"/>
-                <w:szCs w:val="40"/>
-              </w:rPr>
-            </w:pPr>
-            <w:r>
-              <w:rPr>
+                <w:rFonts w:ascii="Courier New" w:hAnsi="Courier New" w:cs="Courier New"/>
+                <w:sz w:val="40"/>
+                <w:szCs w:val="40"/>
+              </w:rPr>
+            </w:pPr>
+            <w:r>
+              <w:rPr>
+                <w:rFonts w:ascii="Courier New" w:hAnsi="Courier New" w:cs="Courier New"/>
                 <w:sz w:val="40"/>
                 <w:szCs w:val="40"/>
               </w:rPr>
@@ -288,14 +457,16 @@
             <w:pPr>
               <w:jc w:val="center"/>
               <w:rPr>
-                <w:b/>
-                <w:bCs/>
-                <w:sz w:val="40"/>
-                <w:szCs w:val="40"/>
-              </w:rPr>
-            </w:pPr>
-            <w:r>
-              <w:rPr>
+                <w:rFonts w:ascii="Courier New" w:hAnsi="Courier New" w:cs="Courier New"/>
+                <w:b/>
+                <w:bCs/>
+                <w:sz w:val="40"/>
+                <w:szCs w:val="40"/>
+              </w:rPr>
+            </w:pPr>
+            <w:r>
+              <w:rPr>
+                <w:rFonts w:ascii="Courier New" w:hAnsi="Courier New" w:cs="Courier New"/>
                 <w:b/>
                 <w:bCs/>
                 <w:sz w:val="40"/>
@@ -308,16 +479,18 @@
             <w:pPr>
               <w:jc w:val="center"/>
               <w:rPr>
-                <w:sz w:val="40"/>
-                <w:szCs w:val="40"/>
-              </w:rPr>
-            </w:pPr>
-            <w:r>
-              <w:rPr>
-                <w:sz w:val="40"/>
-                <w:szCs w:val="40"/>
-              </w:rPr>
-              <w:t>BRIDGE</w:t>
+                <w:rFonts w:ascii="Courier New" w:hAnsi="Courier New" w:cs="Courier New"/>
+                <w:sz w:val="40"/>
+                <w:szCs w:val="40"/>
+              </w:rPr>
+            </w:pPr>
+            <w:r>
+              <w:rPr>
+                <w:rFonts w:ascii="Courier New" w:hAnsi="Courier New" w:cs="Courier New"/>
+                <w:sz w:val="40"/>
+                <w:szCs w:val="40"/>
+              </w:rPr>
+              <w:t>SHEVLIN</w:t>
             </w:r>
           </w:p>
         </w:tc>
@@ -335,29 +508,62 @@
             <w:pPr>
               <w:jc w:val="center"/>
               <w:rPr>
-                <w:sz w:val="40"/>
-                <w:szCs w:val="40"/>
-              </w:rPr>
-            </w:pPr>
-            <w:r>
-              <w:rPr>
+                <w:rFonts w:ascii="Courier New" w:hAnsi="Courier New" w:cs="Courier New"/>
+                <w:sz w:val="40"/>
+                <w:szCs w:val="40"/>
+              </w:rPr>
+            </w:pPr>
+            <w:r>
+              <w:rPr>
+                <w:rFonts w:ascii="Courier New" w:hAnsi="Courier New" w:cs="Courier New"/>
+                <w:b/>
+                <w:bCs/>
                 <w:sz w:val="40"/>
                 <w:szCs w:val="40"/>
               </w:rPr>
               <w:lastRenderedPageBreak/>
-              <w:t>6 9 22 5 14 9 14 5 16 15 9 14 20 5 9 7 8 20 19 5 3 15 14 4 19 23 5 19 20</w:t>
-            </w:r>
-          </w:p>
-        </w:tc>
-        <w:tc>
-          <w:tcPr>
-            <w:tcW w:w="4680" w:type="dxa"/>
-            <w:vAlign w:val="center"/>
-          </w:tcPr>
-          <w:p>
-            <w:pPr>
-              <w:jc w:val="center"/>
-              <w:rPr>
+              <w:t>EI.H” 23</w:t>
+            </w:r>
+          </w:p>
+          <w:p>
+            <w:pPr>
+              <w:jc w:val="center"/>
+              <w:rPr>
+                <w:rFonts w:ascii="Courier New" w:hAnsi="Courier New" w:cs="Courier New"/>
+                <w:sz w:val="40"/>
+                <w:szCs w:val="40"/>
+              </w:rPr>
+            </w:pPr>
+          </w:p>
+          <w:p>
+            <w:pPr>
+              <w:jc w:val="center"/>
+              <w:rPr>
+                <w:rFonts w:ascii="Courier New" w:hAnsi="Courier New" w:cs="Courier New"/>
+                <w:sz w:val="40"/>
+                <w:szCs w:val="40"/>
+              </w:rPr>
+            </w:pPr>
+            <w:r>
+              <w:rPr>
+                <w:rFonts w:ascii="Courier New" w:hAnsi="Courier New" w:cs="Courier New"/>
+                <w:sz w:val="40"/>
+                <w:szCs w:val="40"/>
+              </w:rPr>
+              <w:t>AOPZ 4-KPNPA CHSBL PZ FVBY MPUHS IFWHZZ JVKL.</w:t>
+            </w:r>
+          </w:p>
+        </w:tc>
+        <w:tc>
+          <w:tcPr>
+            <w:tcW w:w="4680" w:type="dxa"/>
+            <w:vAlign w:val="center"/>
+          </w:tcPr>
+          <w:p>
+            <w:pPr>
+              <w:jc w:val="center"/>
+              <w:rPr>
+                <w:rFonts w:ascii="Courier New" w:hAnsi="Courier New" w:cs="Courier New"/>
                 <w:sz w:val="40"/>
                 <w:szCs w:val="40"/>
               </w:rPr>
@@ -378,21 +584,23 @@
             <w:pPr>
               <w:jc w:val="center"/>
               <w:rPr>
-                <w:sz w:val="40"/>
-                <w:szCs w:val="40"/>
-              </w:rPr>
-            </w:pPr>
-          </w:p>
-        </w:tc>
-        <w:tc>
-          <w:tcPr>
-            <w:tcW w:w="4680" w:type="dxa"/>
-            <w:vAlign w:val="center"/>
-          </w:tcPr>
-          <w:p>
-            <w:pPr>
-              <w:jc w:val="center"/>
-              <w:rPr>
+                <w:rFonts w:ascii="Courier New" w:hAnsi="Courier New" w:cs="Courier New"/>
+                <w:sz w:val="40"/>
+                <w:szCs w:val="40"/>
+              </w:rPr>
+            </w:pPr>
+          </w:p>
+        </w:tc>
+        <w:tc>
+          <w:tcPr>
+            <w:tcW w:w="4680" w:type="dxa"/>
+            <w:vAlign w:val="center"/>
+          </w:tcPr>
+          <w:p>
+            <w:pPr>
+              <w:jc w:val="center"/>
+              <w:rPr>
+                <w:rFonts w:ascii="Courier New" w:hAnsi="Courier New" w:cs="Courier New"/>
                 <w:sz w:val="40"/>
                 <w:szCs w:val="40"/>
               </w:rPr>
@@ -413,25 +621,57 @@
             <w:pPr>
               <w:jc w:val="center"/>
               <w:rPr>
-                <w:sz w:val="40"/>
-                <w:szCs w:val="40"/>
-              </w:rPr>
-            </w:pPr>
-          </w:p>
-        </w:tc>
-        <w:tc>
-          <w:tcPr>
-            <w:tcW w:w="4680" w:type="dxa"/>
-            <w:vAlign w:val="center"/>
-          </w:tcPr>
-          <w:p>
-            <w:pPr>
-              <w:jc w:val="center"/>
-              <w:rPr>
-                <w:sz w:val="40"/>
-                <w:szCs w:val="40"/>
-              </w:rPr>
-            </w:pPr>
+                <w:rFonts w:ascii="Courier New" w:hAnsi="Courier New" w:cs="Courier New"/>
+                <w:sz w:val="40"/>
+                <w:szCs w:val="40"/>
+              </w:rPr>
+            </w:pPr>
+          </w:p>
+        </w:tc>
+        <w:tc>
+          <w:tcPr>
+            <w:tcW w:w="4680" w:type="dxa"/>
+            <w:vAlign w:val="center"/>
+          </w:tcPr>
+          <w:p>
+            <w:pPr>
+              <w:jc w:val="center"/>
+              <w:rPr>
+                <w:rFonts w:ascii="Courier New" w:hAnsi="Courier New" w:cs="Courier New"/>
+                <w:b/>
+                <w:bCs/>
+                <w:sz w:val="40"/>
+                <w:szCs w:val="40"/>
+              </w:rPr>
+            </w:pPr>
+            <w:r>
+              <w:rPr>
+                <w:rFonts w:ascii="Courier New" w:hAnsi="Courier New" w:cs="Courier New"/>
+                <w:b/>
+                <w:bCs/>
+                <w:sz w:val="40"/>
+                <w:szCs w:val="40"/>
+              </w:rPr>
+              <w:t>DELTA KEY:</w:t>
+            </w:r>
+          </w:p>
+          <w:p>
+            <w:pPr>
+              <w:jc w:val="center"/>
+              <w:rPr>
+                <w:rFonts w:ascii="Courier New" w:hAnsi="Courier New" w:cs="Courier New"/>
+                <w:sz w:val="40"/>
+                <w:szCs w:val="40"/>
+              </w:rPr>
+            </w:pPr>
+            <w:r>
+              <w:rPr>
+                <w:rFonts w:ascii="Courier New" w:hAnsi="Courier New" w:cs="Courier New"/>
+                <w:sz w:val="40"/>
+                <w:szCs w:val="40"/>
+              </w:rPr>
+              <w:t>HOME</w:t>
+            </w:r>
           </w:p>
         </w:tc>
       </w:tr>
@@ -448,21 +688,23 @@
             <w:pPr>
               <w:jc w:val="center"/>
               <w:rPr>
-                <w:sz w:val="40"/>
-                <w:szCs w:val="40"/>
-              </w:rPr>
-            </w:pPr>
-          </w:p>
-        </w:tc>
-        <w:tc>
-          <w:tcPr>
-            <w:tcW w:w="4680" w:type="dxa"/>
-            <w:vAlign w:val="center"/>
-          </w:tcPr>
-          <w:p>
-            <w:pPr>
-              <w:jc w:val="center"/>
-              <w:rPr>
+                <w:rFonts w:ascii="Courier New" w:hAnsi="Courier New" w:cs="Courier New"/>
+                <w:sz w:val="40"/>
+                <w:szCs w:val="40"/>
+              </w:rPr>
+            </w:pPr>
+          </w:p>
+        </w:tc>
+        <w:tc>
+          <w:tcPr>
+            <w:tcW w:w="4680" w:type="dxa"/>
+            <w:vAlign w:val="center"/>
+          </w:tcPr>
+          <w:p>
+            <w:pPr>
+              <w:jc w:val="center"/>
+              <w:rPr>
+                <w:rFonts w:ascii="Courier New" w:hAnsi="Courier New" w:cs="Courier New"/>
                 <w:sz w:val="40"/>
                 <w:szCs w:val="40"/>
               </w:rPr>
@@ -474,6 +716,7 @@
     <w:p>
       <w:pPr>
         <w:rPr>
+          <w:rFonts w:ascii="Courier New" w:hAnsi="Courier New" w:cs="Courier New"/>
           <w:sz w:val="40"/>
           <w:szCs w:val="40"/>
         </w:rPr>

</xml_diff>